<commit_message>
Make DOCX Word-ready: auto TOC, fixed table grids, cover & doc properties
- Daftar isi sebagai field TOC asli (updateFields) + isi bernomor halaman
  hasil pipeline dua tahap (40 entri, terverifikasi akurat)
- Tabel memakai tblLayout fixed + tblGrid agar lebar kolom dihormati Word
- Sampul dirapikan (garis pemisah, spasi terkendali, tanpa glif rusak)
- Properti dokumen: judul, subjek, penulis, kata kunci, bahasa id-ID

Co-authored-by: arena-agent <297053741+arena-agent@users.noreply.github.com>
</commit_message>
<xml_diff>
--- a/case-4-armada-pengiriman/output/laporan-studi-kasus-4.docx
+++ b/case-4-armada-pengiriman/output/laporan-studi-kasus-4.docx
@@ -4,23 +4,25 @@
   <w:body>
     <w:p>
       <w:pPr>
-        <w:spacing w:after="0"/>
+        <w:spacing w:after="0" w:before="0" w:line="240" w:lineRule="auto"/>
       </w:pPr>
+      <w:r>
+        <w:rPr>
+          <w:sz w:val="30"/>
+        </w:rPr>
+      </w:r>
     </w:p>
     <w:p>
       <w:pPr>
-        <w:spacing w:after="0"/>
-      </w:pPr>
-    </w:p>
-    <w:p>
-      <w:pPr>
-        <w:spacing w:line="240" w:lineRule="auto" w:after="40"/>
+        <w:spacing w:line="240" w:lineRule="auto" w:after="40" w:before="0"/>
+        <w:ind w:firstLine="0"/>
         <w:jc w:val="center"/>
       </w:pPr>
       <w:r>
         <w:rPr>
           <w:rFonts w:ascii="Times New Roman" w:hAnsi="Times New Roman"/>
           <w:b/>
+          <w:i w:val="0"/>
           <w:sz w:val="26"/>
         </w:rPr>
         <w:t>INDUSTRIAL TECHNOLOGY CHALLENGE</w:t>
@@ -28,13 +30,15 @@
     </w:p>
     <w:p>
       <w:pPr>
-        <w:spacing w:line="240" w:lineRule="auto" w:after="40"/>
+        <w:spacing w:line="240" w:lineRule="auto" w:after="40" w:before="0"/>
+        <w:ind w:firstLine="0"/>
         <w:jc w:val="center"/>
       </w:pPr>
       <w:r>
         <w:rPr>
           <w:rFonts w:ascii="Times New Roman" w:hAnsi="Times New Roman"/>
           <w:b/>
+          <w:i w:val="0"/>
           <w:sz w:val="26"/>
         </w:rPr>
         <w:t>STUDI KASUS MANAJEMEN INDUSTRI</w:t>
@@ -42,55 +46,61 @@
     </w:p>
     <w:p>
       <w:pPr>
-        <w:spacing w:after="0"/>
+        <w:spacing w:before="120" w:after="120" w:line="240" w:lineRule="auto"/>
         <w:jc w:val="center"/>
+        <w:pBdr>
+          <w:bottom w:val="single" w:sz="8" w:space="1" w:color="1F3864"/>
+        </w:pBdr>
+      </w:pPr>
+    </w:p>
+    <w:p>
+      <w:pPr>
+        <w:spacing w:after="0" w:before="0" w:line="240" w:lineRule="auto"/>
       </w:pPr>
       <w:r>
         <w:rPr>
-          <w:sz w:val="18"/>
+          <w:sz w:val="84"/>
         </w:rPr>
-        <w:t>──────────────────────────────────────────────</w:t>
       </w:r>
     </w:p>
     <w:p>
       <w:pPr>
-        <w:spacing w:after="0"/>
-      </w:pPr>
-    </w:p>
-    <w:p>
-      <w:pPr>
-        <w:spacing w:after="0"/>
-      </w:pPr>
-    </w:p>
-    <w:p>
-      <w:pPr>
-        <w:spacing w:after="0"/>
-      </w:pPr>
-    </w:p>
-    <w:p>
-      <w:pPr>
-        <w:spacing w:line="240" w:lineRule="auto" w:after="40"/>
+        <w:spacing w:line="240" w:lineRule="auto" w:after="40" w:before="0"/>
+        <w:ind w:firstLine="0"/>
         <w:jc w:val="center"/>
       </w:pPr>
       <w:r>
         <w:rPr>
           <w:rFonts w:ascii="Times New Roman" w:hAnsi="Times New Roman"/>
           <w:b/>
+          <w:i w:val="0"/>
           <w:color w:val="1F3864"/>
-          <w:sz w:val="38"/>
+          <w:sz w:val="36"/>
         </w:rPr>
         <w:t>ARMADA BANYAK, PENGIRIMAN TETAP TERLAMBAT</w:t>
       </w:r>
     </w:p>
     <w:p>
       <w:pPr>
-        <w:spacing w:line="240" w:lineRule="auto" w:after="40"/>
+        <w:spacing w:after="0" w:before="0" w:line="240" w:lineRule="auto"/>
+      </w:pPr>
+      <w:r>
+        <w:rPr>
+          <w:sz w:val="12"/>
+        </w:rPr>
+      </w:r>
+    </w:p>
+    <w:p>
+      <w:pPr>
+        <w:spacing w:line="240" w:lineRule="auto" w:after="40" w:before="0"/>
+        <w:ind w:firstLine="0"/>
         <w:jc w:val="center"/>
       </w:pPr>
       <w:r>
         <w:rPr>
           <w:rFonts w:ascii="Times New Roman" w:hAnsi="Times New Roman"/>
           <w:b w:val="0"/>
+          <w:i w:val="0"/>
           <w:sz w:val="24"/>
         </w:rPr>
         <w:t>Analisis Efisiensi Distribusi dan Kualitas Layanan</w:t>
@@ -98,13 +108,15 @@
     </w:p>
     <w:p>
       <w:pPr>
-        <w:spacing w:line="240" w:lineRule="auto" w:after="40"/>
+        <w:spacing w:line="240" w:lineRule="auto" w:after="40" w:before="0"/>
+        <w:ind w:firstLine="0"/>
         <w:jc w:val="center"/>
       </w:pPr>
       <w:r>
         <w:rPr>
           <w:rFonts w:ascii="Times New Roman" w:hAnsi="Times New Roman"/>
           <w:b w:val="0"/>
+          <w:i w:val="0"/>
           <w:sz w:val="24"/>
         </w:rPr>
         <w:t>pada Perusahaan Distribusi Barang Konsumsi</w:t>
@@ -112,13 +124,26 @@
     </w:p>
     <w:p>
       <w:pPr>
-        <w:spacing w:line="240" w:lineRule="auto" w:after="40"/>
+        <w:spacing w:after="0" w:before="0" w:line="240" w:lineRule="auto"/>
+      </w:pPr>
+      <w:r>
+        <w:rPr>
+          <w:sz w:val="6"/>
+        </w:rPr>
+      </w:r>
+    </w:p>
+    <w:p>
+      <w:pPr>
+        <w:spacing w:line="240" w:lineRule="auto" w:after="40" w:before="0"/>
+        <w:ind w:firstLine="0"/>
         <w:jc w:val="center"/>
       </w:pPr>
       <w:r>
         <w:rPr>
           <w:rFonts w:ascii="Times New Roman" w:hAnsi="Times New Roman"/>
           <w:b w:val="0"/>
+          <w:i w:val="0"/>
+          <w:color w:val="595959"/>
           <w:sz w:val="22"/>
         </w:rPr>
         <w:t>(Studi Kasus 4 — Bidang Supply Chain &amp; Distribution)</w:t>
@@ -126,23 +151,25 @@
     </w:p>
     <w:p>
       <w:pPr>
-        <w:spacing w:after="0"/>
+        <w:spacing w:after="0" w:before="0" w:line="240" w:lineRule="auto"/>
       </w:pPr>
+      <w:r>
+        <w:rPr>
+          <w:sz w:val="39"/>
+        </w:rPr>
+      </w:r>
     </w:p>
     <w:p>
       <w:pPr>
-        <w:spacing w:after="0"/>
-      </w:pPr>
-    </w:p>
-    <w:p>
-      <w:pPr>
-        <w:spacing w:line="240" w:lineRule="auto" w:after="40"/>
+        <w:spacing w:line="240" w:lineRule="auto" w:after="40" w:before="0"/>
+        <w:ind w:firstLine="0"/>
         <w:jc w:val="center"/>
       </w:pPr>
       <w:r>
         <w:rPr>
           <w:rFonts w:ascii="Times New Roman" w:hAnsi="Times New Roman"/>
           <w:b/>
+          <w:i w:val="0"/>
           <w:sz w:val="24"/>
         </w:rPr>
         <w:t>LAPORAN STUDI KASUS</w:t>
@@ -150,33 +177,25 @@
     </w:p>
     <w:p>
       <w:pPr>
-        <w:spacing w:after="0"/>
+        <w:spacing w:after="0" w:before="0" w:line="240" w:lineRule="auto"/>
       </w:pPr>
+      <w:r>
+        <w:rPr>
+          <w:sz w:val="108"/>
+        </w:rPr>
+      </w:r>
     </w:p>
     <w:p>
       <w:pPr>
-        <w:spacing w:after="0"/>
-      </w:pPr>
-    </w:p>
-    <w:p>
-      <w:pPr>
-        <w:spacing w:after="0"/>
-      </w:pPr>
-    </w:p>
-    <w:p>
-      <w:pPr>
-        <w:spacing w:after="0"/>
-      </w:pPr>
-    </w:p>
-    <w:p>
-      <w:pPr>
-        <w:spacing w:line="240" w:lineRule="auto" w:after="40"/>
+        <w:spacing w:line="240" w:lineRule="auto" w:after="40" w:before="0"/>
+        <w:ind w:firstLine="0"/>
         <w:jc w:val="center"/>
       </w:pPr>
       <w:r>
         <w:rPr>
           <w:rFonts w:ascii="Times New Roman" w:hAnsi="Times New Roman"/>
           <w:b w:val="0"/>
+          <w:i w:val="0"/>
           <w:sz w:val="22"/>
         </w:rPr>
         <w:t>Disusun oleh:</w:t>
@@ -184,13 +203,15 @@
     </w:p>
     <w:p>
       <w:pPr>
-        <w:spacing w:line="240" w:lineRule="auto" w:after="40"/>
+        <w:spacing w:line="240" w:lineRule="auto" w:after="40" w:before="0"/>
+        <w:ind w:firstLine="0"/>
         <w:jc w:val="center"/>
       </w:pPr>
       <w:r>
         <w:rPr>
           <w:rFonts w:ascii="Times New Roman" w:hAnsi="Times New Roman"/>
           <w:b/>
+          <w:i w:val="0"/>
           <w:sz w:val="24"/>
         </w:rPr>
         <w:t>[Nama Mahasiswa]</w:t>
@@ -198,13 +219,15 @@
     </w:p>
     <w:p>
       <w:pPr>
-        <w:spacing w:line="240" w:lineRule="auto" w:after="40"/>
+        <w:spacing w:line="240" w:lineRule="auto" w:after="40" w:before="0"/>
+        <w:ind w:firstLine="0"/>
         <w:jc w:val="center"/>
       </w:pPr>
       <w:r>
         <w:rPr>
           <w:rFonts w:ascii="Times New Roman" w:hAnsi="Times New Roman"/>
           <w:b w:val="0"/>
+          <w:i w:val="0"/>
           <w:sz w:val="22"/>
         </w:rPr>
         <w:t>NIM: [....................]          Kelas: [....................]</w:t>
@@ -212,23 +235,25 @@
     </w:p>
     <w:p>
       <w:pPr>
-        <w:spacing w:after="0"/>
+        <w:spacing w:after="0" w:before="0" w:line="240" w:lineRule="auto"/>
       </w:pPr>
+      <w:r>
+        <w:rPr>
+          <w:sz w:val="27"/>
+        </w:rPr>
+      </w:r>
     </w:p>
     <w:p>
       <w:pPr>
-        <w:spacing w:after="0"/>
-      </w:pPr>
-    </w:p>
-    <w:p>
-      <w:pPr>
-        <w:spacing w:line="240" w:lineRule="auto" w:after="40"/>
+        <w:spacing w:line="240" w:lineRule="auto" w:after="40" w:before="0"/>
+        <w:ind w:firstLine="0"/>
         <w:jc w:val="center"/>
       </w:pPr>
       <w:r>
         <w:rPr>
           <w:rFonts w:ascii="Times New Roman" w:hAnsi="Times New Roman"/>
           <w:b w:val="0"/>
+          <w:i w:val="0"/>
           <w:sz w:val="22"/>
         </w:rPr>
         <w:t>Mata Kuliah: Manajemen Industri</w:t>
@@ -236,13 +261,15 @@
     </w:p>
     <w:p>
       <w:pPr>
-        <w:spacing w:line="240" w:lineRule="auto" w:after="40"/>
+        <w:spacing w:line="240" w:lineRule="auto" w:after="40" w:before="0"/>
+        <w:ind w:firstLine="0"/>
         <w:jc w:val="center"/>
       </w:pPr>
       <w:r>
         <w:rPr>
           <w:rFonts w:ascii="Times New Roman" w:hAnsi="Times New Roman"/>
           <w:b w:val="0"/>
+          <w:i w:val="0"/>
           <w:sz w:val="22"/>
         </w:rPr>
         <w:t>Dosen Pengampu: [Nama Dosen Pengampu]</w:t>
@@ -250,28 +277,25 @@
     </w:p>
     <w:p>
       <w:pPr>
-        <w:spacing w:after="0"/>
+        <w:spacing w:after="0" w:before="0" w:line="240" w:lineRule="auto"/>
       </w:pPr>
+      <w:r>
+        <w:rPr>
+          <w:sz w:val="96"/>
+        </w:rPr>
+      </w:r>
     </w:p>
     <w:p>
       <w:pPr>
-        <w:spacing w:after="0"/>
-      </w:pPr>
-    </w:p>
-    <w:p>
-      <w:pPr>
-        <w:spacing w:after="0"/>
-      </w:pPr>
-    </w:p>
-    <w:p>
-      <w:pPr>
-        <w:spacing w:line="240" w:lineRule="auto" w:after="40"/>
+        <w:spacing w:line="240" w:lineRule="auto" w:after="40" w:before="0"/>
+        <w:ind w:firstLine="0"/>
         <w:jc w:val="center"/>
       </w:pPr>
       <w:r>
         <w:rPr>
           <w:rFonts w:ascii="Times New Roman" w:hAnsi="Times New Roman"/>
           <w:b/>
+          <w:i w:val="0"/>
           <w:sz w:val="24"/>
         </w:rPr>
         <w:t>PROGRAM STUDI [NAMA PROGRAM STUDI]</w:t>
@@ -279,13 +303,15 @@
     </w:p>
     <w:p>
       <w:pPr>
-        <w:spacing w:line="240" w:lineRule="auto" w:after="40"/>
+        <w:spacing w:line="240" w:lineRule="auto" w:after="40" w:before="0"/>
+        <w:ind w:firstLine="0"/>
         <w:jc w:val="center"/>
       </w:pPr>
       <w:r>
         <w:rPr>
           <w:rFonts w:ascii="Times New Roman" w:hAnsi="Times New Roman"/>
           <w:b/>
+          <w:i w:val="0"/>
           <w:sz w:val="24"/>
         </w:rPr>
         <w:t>FAKULTAS [NAMA FAKULTAS]</w:t>
@@ -293,13 +319,15 @@
     </w:p>
     <w:p>
       <w:pPr>
-        <w:spacing w:line="240" w:lineRule="auto" w:after="40"/>
+        <w:spacing w:line="240" w:lineRule="auto" w:after="40" w:before="0"/>
+        <w:ind w:firstLine="0"/>
         <w:jc w:val="center"/>
       </w:pPr>
       <w:r>
         <w:rPr>
           <w:rFonts w:ascii="Times New Roman" w:hAnsi="Times New Roman"/>
           <w:b/>
+          <w:i w:val="0"/>
           <w:sz w:val="24"/>
         </w:rPr>
         <w:t>UNIVERSITAS [NAMA UNIVERSITAS]</w:t>
@@ -307,16 +335,939 @@
     </w:p>
     <w:p>
       <w:pPr>
-        <w:spacing w:line="240" w:lineRule="auto" w:after="40"/>
+        <w:spacing w:line="240" w:lineRule="auto" w:after="40" w:before="0"/>
+        <w:ind w:firstLine="0"/>
         <w:jc w:val="center"/>
       </w:pPr>
       <w:r>
         <w:rPr>
           <w:rFonts w:ascii="Times New Roman" w:hAnsi="Times New Roman"/>
           <w:b/>
+          <w:i w:val="0"/>
           <w:sz w:val="24"/>
         </w:rPr>
         <w:t>TAHUN [20XX]</w:t>
+      </w:r>
+    </w:p>
+    <w:p>
+      <w:pPr>
+        <w:spacing w:after="0"/>
+      </w:pPr>
+      <w:r>
+        <w:br w:type="page"/>
+      </w:r>
+    </w:p>
+    <w:p>
+      <w:pPr>
+        <w:keepNext/>
+        <w:spacing w:line="240" w:lineRule="auto" w:before="0" w:after="240"/>
+        <w:jc w:val="center"/>
+      </w:pPr>
+      <w:r>
+        <w:rPr>
+          <w:rFonts w:ascii="Times New Roman" w:hAnsi="Times New Roman"/>
+          <w:b/>
+          <w:color w:val="000000"/>
+          <w:sz w:val="24"/>
+        </w:rPr>
+        <w:t>DAFTAR ISI</w:t>
+      </w:r>
+    </w:p>
+    <w:p>
+      <w:pPr>
+        <w:spacing w:after="0" w:line="240" w:lineRule="auto"/>
+      </w:pPr>
+      <w:r>
+        <w:fldChar w:fldCharType="begin"/>
+      </w:r>
+      <w:r>
+        <w:instrText xml:space="preserve"> TOC \o "1-3" \h \z \u </w:instrText>
+      </w:r>
+      <w:r>
+        <w:fldChar w:fldCharType="separate"/>
+      </w:r>
+    </w:p>
+    <w:p>
+      <w:pPr>
+        <w:pStyle w:val="TOC1"/>
+      </w:pPr>
+      <w:r>
+        <w:rPr>
+          <w:rFonts w:ascii="Times New Roman" w:hAnsi="Times New Roman"/>
+          <w:b/>
+          <w:sz w:val="21"/>
+        </w:rPr>
+        <w:t>BAB I  PENDAHULUAN</w:t>
+      </w:r>
+      <w:r>
+        <w:rPr>
+          <w:rFonts w:ascii="Times New Roman" w:hAnsi="Times New Roman"/>
+          <w:b/>
+          <w:sz w:val="21"/>
+        </w:rPr>
+        <w:tab/>
+        <w:t>4</w:t>
+      </w:r>
+    </w:p>
+    <w:p>
+      <w:pPr>
+        <w:pStyle w:val="TOC2"/>
+      </w:pPr>
+      <w:r>
+        <w:rPr>
+          <w:rFonts w:ascii="Times New Roman" w:hAnsi="Times New Roman"/>
+          <w:b w:val="0"/>
+          <w:sz w:val="21"/>
+        </w:rPr>
+        <w:t>1.1  Latar Belakang</w:t>
+      </w:r>
+      <w:r>
+        <w:rPr>
+          <w:rFonts w:ascii="Times New Roman" w:hAnsi="Times New Roman"/>
+          <w:b w:val="0"/>
+          <w:sz w:val="21"/>
+        </w:rPr>
+        <w:tab/>
+        <w:t>4</w:t>
+      </w:r>
+    </w:p>
+    <w:p>
+      <w:pPr>
+        <w:pStyle w:val="TOC2"/>
+      </w:pPr>
+      <w:r>
+        <w:rPr>
+          <w:rFonts w:ascii="Times New Roman" w:hAnsi="Times New Roman"/>
+          <w:b w:val="0"/>
+          <w:sz w:val="21"/>
+        </w:rPr>
+        <w:t>1.2  Identifikasi Masalah</w:t>
+      </w:r>
+      <w:r>
+        <w:rPr>
+          <w:rFonts w:ascii="Times New Roman" w:hAnsi="Times New Roman"/>
+          <w:b w:val="0"/>
+          <w:sz w:val="21"/>
+        </w:rPr>
+        <w:tab/>
+        <w:t>4</w:t>
+      </w:r>
+    </w:p>
+    <w:p>
+      <w:pPr>
+        <w:pStyle w:val="TOC2"/>
+      </w:pPr>
+      <w:r>
+        <w:rPr>
+          <w:rFonts w:ascii="Times New Roman" w:hAnsi="Times New Roman"/>
+          <w:b w:val="0"/>
+          <w:sz w:val="21"/>
+        </w:rPr>
+        <w:t>1.3  Rumusan Masalah</w:t>
+      </w:r>
+      <w:r>
+        <w:rPr>
+          <w:rFonts w:ascii="Times New Roman" w:hAnsi="Times New Roman"/>
+          <w:b w:val="0"/>
+          <w:sz w:val="21"/>
+        </w:rPr>
+        <w:tab/>
+        <w:t>4</w:t>
+      </w:r>
+    </w:p>
+    <w:p>
+      <w:pPr>
+        <w:pStyle w:val="TOC2"/>
+      </w:pPr>
+      <w:r>
+        <w:rPr>
+          <w:rFonts w:ascii="Times New Roman" w:hAnsi="Times New Roman"/>
+          <w:b w:val="0"/>
+          <w:sz w:val="21"/>
+        </w:rPr>
+        <w:t>1.4  Tujuan Analisis</w:t>
+      </w:r>
+      <w:r>
+        <w:rPr>
+          <w:rFonts w:ascii="Times New Roman" w:hAnsi="Times New Roman"/>
+          <w:b w:val="0"/>
+          <w:sz w:val="21"/>
+        </w:rPr>
+        <w:tab/>
+        <w:t>5</w:t>
+      </w:r>
+    </w:p>
+    <w:p>
+      <w:pPr>
+        <w:pStyle w:val="TOC2"/>
+      </w:pPr>
+      <w:r>
+        <w:rPr>
+          <w:rFonts w:ascii="Times New Roman" w:hAnsi="Times New Roman"/>
+          <w:b w:val="0"/>
+          <w:sz w:val="21"/>
+        </w:rPr>
+        <w:t>1.5  Ruang Lingkup dan Batasan</w:t>
+      </w:r>
+      <w:r>
+        <w:rPr>
+          <w:rFonts w:ascii="Times New Roman" w:hAnsi="Times New Roman"/>
+          <w:b w:val="0"/>
+          <w:sz w:val="21"/>
+        </w:rPr>
+        <w:tab/>
+        <w:t>5</w:t>
+      </w:r>
+    </w:p>
+    <w:p>
+      <w:pPr>
+        <w:pStyle w:val="TOC1"/>
+      </w:pPr>
+      <w:r>
+        <w:rPr>
+          <w:rFonts w:ascii="Times New Roman" w:hAnsi="Times New Roman"/>
+          <w:b/>
+          <w:sz w:val="21"/>
+        </w:rPr>
+        <w:t>BAB II  LANDASAN TEORI</w:t>
+      </w:r>
+      <w:r>
+        <w:rPr>
+          <w:rFonts w:ascii="Times New Roman" w:hAnsi="Times New Roman"/>
+          <w:b/>
+          <w:sz w:val="21"/>
+        </w:rPr>
+        <w:tab/>
+        <w:t>5</w:t>
+      </w:r>
+    </w:p>
+    <w:p>
+      <w:pPr>
+        <w:pStyle w:val="TOC2"/>
+      </w:pPr>
+      <w:r>
+        <w:rPr>
+          <w:rFonts w:ascii="Times New Roman" w:hAnsi="Times New Roman"/>
+          <w:b w:val="0"/>
+          <w:sz w:val="21"/>
+        </w:rPr>
+        <w:t>2.1  Kajian Teori</w:t>
+      </w:r>
+      <w:r>
+        <w:rPr>
+          <w:rFonts w:ascii="Times New Roman" w:hAnsi="Times New Roman"/>
+          <w:b w:val="0"/>
+          <w:sz w:val="21"/>
+        </w:rPr>
+        <w:tab/>
+        <w:t>5</w:t>
+      </w:r>
+    </w:p>
+    <w:p>
+      <w:pPr>
+        <w:pStyle w:val="TOC2"/>
+      </w:pPr>
+      <w:r>
+        <w:rPr>
+          <w:rFonts w:ascii="Times New Roman" w:hAnsi="Times New Roman"/>
+          <w:b w:val="0"/>
+          <w:sz w:val="21"/>
+        </w:rPr>
+        <w:t>2.2  Penelitian yang Relevan (Identifikasi Fakta dan Data Kasus)</w:t>
+      </w:r>
+      <w:r>
+        <w:rPr>
+          <w:rFonts w:ascii="Times New Roman" w:hAnsi="Times New Roman"/>
+          <w:b w:val="0"/>
+          <w:sz w:val="21"/>
+        </w:rPr>
+        <w:tab/>
+        <w:t>6</w:t>
+      </w:r>
+    </w:p>
+    <w:p>
+      <w:pPr>
+        <w:pStyle w:val="TOC2"/>
+      </w:pPr>
+      <w:r>
+        <w:rPr>
+          <w:rFonts w:ascii="Times New Roman" w:hAnsi="Times New Roman"/>
+          <w:b w:val="0"/>
+          <w:sz w:val="21"/>
+        </w:rPr>
+        <w:t>2.3  Kerangka Berpikir (Gambaran Proses Operasional Saat Ini)</w:t>
+      </w:r>
+      <w:r>
+        <w:rPr>
+          <w:rFonts w:ascii="Times New Roman" w:hAnsi="Times New Roman"/>
+          <w:b w:val="0"/>
+          <w:sz w:val="21"/>
+        </w:rPr>
+        <w:tab/>
+        <w:t>6</w:t>
+      </w:r>
+    </w:p>
+    <w:p>
+      <w:pPr>
+        <w:pStyle w:val="TOC2"/>
+      </w:pPr>
+      <w:r>
+        <w:rPr>
+          <w:rFonts w:ascii="Times New Roman" w:hAnsi="Times New Roman"/>
+          <w:b w:val="0"/>
+          <w:sz w:val="21"/>
+        </w:rPr>
+        <w:t>2.4  Dampak Permasalahan</w:t>
+      </w:r>
+      <w:r>
+        <w:rPr>
+          <w:rFonts w:ascii="Times New Roman" w:hAnsi="Times New Roman"/>
+          <w:b w:val="0"/>
+          <w:sz w:val="21"/>
+        </w:rPr>
+        <w:tab/>
+        <w:t>7</w:t>
+      </w:r>
+    </w:p>
+    <w:p>
+      <w:pPr>
+        <w:pStyle w:val="TOC1"/>
+      </w:pPr>
+      <w:r>
+        <w:rPr>
+          <w:rFonts w:ascii="Times New Roman" w:hAnsi="Times New Roman"/>
+          <w:b/>
+          <w:sz w:val="21"/>
+        </w:rPr>
+        <w:t>BAB III  ANALISIS MASALAH</w:t>
+      </w:r>
+      <w:r>
+        <w:rPr>
+          <w:rFonts w:ascii="Times New Roman" w:hAnsi="Times New Roman"/>
+          <w:b/>
+          <w:sz w:val="21"/>
+        </w:rPr>
+        <w:tab/>
+        <w:t>8</w:t>
+      </w:r>
+    </w:p>
+    <w:p>
+      <w:pPr>
+        <w:pStyle w:val="TOC2"/>
+      </w:pPr>
+      <w:r>
+        <w:rPr>
+          <w:rFonts w:ascii="Times New Roman" w:hAnsi="Times New Roman"/>
+          <w:b w:val="0"/>
+          <w:sz w:val="21"/>
+        </w:rPr>
+        <w:t>3.1  Penentuan Masalah Utama</w:t>
+      </w:r>
+      <w:r>
+        <w:rPr>
+          <w:rFonts w:ascii="Times New Roman" w:hAnsi="Times New Roman"/>
+          <w:b w:val="0"/>
+          <w:sz w:val="21"/>
+        </w:rPr>
+        <w:tab/>
+        <w:t>8</w:t>
+      </w:r>
+    </w:p>
+    <w:p>
+      <w:pPr>
+        <w:pStyle w:val="TOC2"/>
+      </w:pPr>
+      <w:r>
+        <w:rPr>
+          <w:rFonts w:ascii="Times New Roman" w:hAnsi="Times New Roman"/>
+          <w:b w:val="0"/>
+          <w:sz w:val="21"/>
+        </w:rPr>
+        <w:t>3.2  Analisis Akar Penyebab</w:t>
+      </w:r>
+      <w:r>
+        <w:rPr>
+          <w:rFonts w:ascii="Times New Roman" w:hAnsi="Times New Roman"/>
+          <w:b w:val="0"/>
+          <w:sz w:val="21"/>
+        </w:rPr>
+        <w:tab/>
+        <w:t>8</w:t>
+      </w:r>
+    </w:p>
+    <w:p>
+      <w:pPr>
+        <w:pStyle w:val="TOC2"/>
+      </w:pPr>
+      <w:r>
+        <w:rPr>
+          <w:rFonts w:ascii="Times New Roman" w:hAnsi="Times New Roman"/>
+          <w:b w:val="0"/>
+          <w:sz w:val="21"/>
+        </w:rPr>
+        <w:t>3.3  Kebutuhan Perbaikan</w:t>
+      </w:r>
+      <w:r>
+        <w:rPr>
+          <w:rFonts w:ascii="Times New Roman" w:hAnsi="Times New Roman"/>
+          <w:b w:val="0"/>
+          <w:sz w:val="21"/>
+        </w:rPr>
+        <w:tab/>
+        <w:t>9</w:t>
+      </w:r>
+    </w:p>
+    <w:p>
+      <w:pPr>
+        <w:pStyle w:val="TOC2"/>
+      </w:pPr>
+      <w:r>
+        <w:rPr>
+          <w:rFonts w:ascii="Times New Roman" w:hAnsi="Times New Roman"/>
+          <w:b w:val="0"/>
+          <w:sz w:val="21"/>
+        </w:rPr>
+        <w:t>3.4  Asumsi dan Keterbatasan Data</w:t>
+      </w:r>
+      <w:r>
+        <w:rPr>
+          <w:rFonts w:ascii="Times New Roman" w:hAnsi="Times New Roman"/>
+          <w:b w:val="0"/>
+          <w:sz w:val="21"/>
+        </w:rPr>
+        <w:tab/>
+        <w:t>9</w:t>
+      </w:r>
+    </w:p>
+    <w:p>
+      <w:pPr>
+        <w:pStyle w:val="TOC1"/>
+      </w:pPr>
+      <w:r>
+        <w:rPr>
+          <w:rFonts w:ascii="Times New Roman" w:hAnsi="Times New Roman"/>
+          <w:b/>
+          <w:sz w:val="21"/>
+        </w:rPr>
+        <w:t>BAB IV  HASIL DAN PEMBAHASAN</w:t>
+      </w:r>
+      <w:r>
+        <w:rPr>
+          <w:rFonts w:ascii="Times New Roman" w:hAnsi="Times New Roman"/>
+          <w:b/>
+          <w:sz w:val="21"/>
+        </w:rPr>
+        <w:tab/>
+        <w:t>10</w:t>
+      </w:r>
+    </w:p>
+    <w:p>
+      <w:pPr>
+        <w:pStyle w:val="TOC2"/>
+      </w:pPr>
+      <w:r>
+        <w:rPr>
+          <w:rFonts w:ascii="Times New Roman" w:hAnsi="Times New Roman"/>
+          <w:b w:val="0"/>
+          <w:sz w:val="21"/>
+        </w:rPr>
+        <w:t>4.1  Alternatif Solusi</w:t>
+      </w:r>
+      <w:r>
+        <w:rPr>
+          <w:rFonts w:ascii="Times New Roman" w:hAnsi="Times New Roman"/>
+          <w:b w:val="0"/>
+          <w:sz w:val="21"/>
+        </w:rPr>
+        <w:tab/>
+        <w:t>10</w:t>
+      </w:r>
+    </w:p>
+    <w:p>
+      <w:pPr>
+        <w:pStyle w:val="TOC2"/>
+      </w:pPr>
+      <w:r>
+        <w:rPr>
+          <w:rFonts w:ascii="Times New Roman" w:hAnsi="Times New Roman"/>
+          <w:b w:val="0"/>
+          <w:sz w:val="21"/>
+        </w:rPr>
+        <w:t>4.2  Penentuan Kriteria Evaluasi</w:t>
+      </w:r>
+      <w:r>
+        <w:rPr>
+          <w:rFonts w:ascii="Times New Roman" w:hAnsi="Times New Roman"/>
+          <w:b w:val="0"/>
+          <w:sz w:val="21"/>
+        </w:rPr>
+        <w:tab/>
+        <w:t>11</w:t>
+      </w:r>
+    </w:p>
+    <w:p>
+      <w:pPr>
+        <w:pStyle w:val="TOC2"/>
+      </w:pPr>
+      <w:r>
+        <w:rPr>
+          <w:rFonts w:ascii="Times New Roman" w:hAnsi="Times New Roman"/>
+          <w:b w:val="0"/>
+          <w:sz w:val="21"/>
+        </w:rPr>
+        <w:t>4.3  Perbandingan Alternatif Solusi</w:t>
+      </w:r>
+      <w:r>
+        <w:rPr>
+          <w:rFonts w:ascii="Times New Roman" w:hAnsi="Times New Roman"/>
+          <w:b w:val="0"/>
+          <w:sz w:val="21"/>
+        </w:rPr>
+        <w:tab/>
+        <w:t>11</w:t>
+      </w:r>
+    </w:p>
+    <w:p>
+      <w:pPr>
+        <w:pStyle w:val="TOC2"/>
+      </w:pPr>
+      <w:r>
+        <w:rPr>
+          <w:rFonts w:ascii="Times New Roman" w:hAnsi="Times New Roman"/>
+          <w:b w:val="0"/>
+          <w:sz w:val="21"/>
+        </w:rPr>
+        <w:t>4.4  Pemilihan Solusi Terbaik dan Justifikasi</w:t>
+      </w:r>
+      <w:r>
+        <w:rPr>
+          <w:rFonts w:ascii="Times New Roman" w:hAnsi="Times New Roman"/>
+          <w:b w:val="0"/>
+          <w:sz w:val="21"/>
+        </w:rPr>
+        <w:tab/>
+        <w:t>13</w:t>
+      </w:r>
+    </w:p>
+    <w:p>
+      <w:pPr>
+        <w:pStyle w:val="TOC1"/>
+      </w:pPr>
+      <w:r>
+        <w:rPr>
+          <w:rFonts w:ascii="Times New Roman" w:hAnsi="Times New Roman"/>
+          <w:b/>
+          <w:sz w:val="21"/>
+        </w:rPr>
+        <w:t>BAB V  PENUTUP</w:t>
+      </w:r>
+      <w:r>
+        <w:rPr>
+          <w:rFonts w:ascii="Times New Roman" w:hAnsi="Times New Roman"/>
+          <w:b/>
+          <w:sz w:val="21"/>
+        </w:rPr>
+        <w:tab/>
+        <w:t>13</w:t>
+      </w:r>
+    </w:p>
+    <w:p>
+      <w:pPr>
+        <w:pStyle w:val="TOC2"/>
+      </w:pPr>
+      <w:r>
+        <w:rPr>
+          <w:rFonts w:ascii="Times New Roman" w:hAnsi="Times New Roman"/>
+          <w:b w:val="0"/>
+          <w:sz w:val="21"/>
+        </w:rPr>
+        <w:t>5.1  Tahapan Implementasi</w:t>
+      </w:r>
+      <w:r>
+        <w:rPr>
+          <w:rFonts w:ascii="Times New Roman" w:hAnsi="Times New Roman"/>
+          <w:b w:val="0"/>
+          <w:sz w:val="21"/>
+        </w:rPr>
+        <w:tab/>
+        <w:t>13</w:t>
+      </w:r>
+    </w:p>
+    <w:p>
+      <w:pPr>
+        <w:pStyle w:val="TOC2"/>
+      </w:pPr>
+      <w:r>
+        <w:rPr>
+          <w:rFonts w:ascii="Times New Roman" w:hAnsi="Times New Roman"/>
+          <w:b w:val="0"/>
+          <w:sz w:val="21"/>
+        </w:rPr>
+        <w:t>5.2  Kebutuhan Sumber Daya</w:t>
+      </w:r>
+      <w:r>
+        <w:rPr>
+          <w:rFonts w:ascii="Times New Roman" w:hAnsi="Times New Roman"/>
+          <w:b w:val="0"/>
+          <w:sz w:val="21"/>
+        </w:rPr>
+        <w:tab/>
+        <w:t>14</w:t>
+      </w:r>
+    </w:p>
+    <w:p>
+      <w:pPr>
+        <w:pStyle w:val="TOC2"/>
+      </w:pPr>
+      <w:r>
+        <w:rPr>
+          <w:rFonts w:ascii="Times New Roman" w:hAnsi="Times New Roman"/>
+          <w:b w:val="0"/>
+          <w:sz w:val="21"/>
+        </w:rPr>
+        <w:t>5.3  Pembagian Tanggung Jawab</w:t>
+      </w:r>
+      <w:r>
+        <w:rPr>
+          <w:rFonts w:ascii="Times New Roman" w:hAnsi="Times New Roman"/>
+          <w:b w:val="0"/>
+          <w:sz w:val="21"/>
+        </w:rPr>
+        <w:tab/>
+        <w:t>14</w:t>
+      </w:r>
+    </w:p>
+    <w:p>
+      <w:pPr>
+        <w:pStyle w:val="TOC2"/>
+      </w:pPr>
+      <w:r>
+        <w:rPr>
+          <w:rFonts w:ascii="Times New Roman" w:hAnsi="Times New Roman"/>
+          <w:b w:val="0"/>
+          <w:sz w:val="21"/>
+        </w:rPr>
+        <w:t>5.4  Identifikasi Risiko dan Mitigasi</w:t>
+      </w:r>
+      <w:r>
+        <w:rPr>
+          <w:rFonts w:ascii="Times New Roman" w:hAnsi="Times New Roman"/>
+          <w:b w:val="0"/>
+          <w:sz w:val="21"/>
+        </w:rPr>
+        <w:tab/>
+        <w:t>14</w:t>
+      </w:r>
+    </w:p>
+    <w:p>
+      <w:pPr>
+        <w:pStyle w:val="TOC2"/>
+      </w:pPr>
+      <w:r>
+        <w:rPr>
+          <w:rFonts w:ascii="Times New Roman" w:hAnsi="Times New Roman"/>
+          <w:b w:val="0"/>
+          <w:sz w:val="21"/>
+        </w:rPr>
+        <w:t>5.5  Indikator Keberhasilan (KPI)</w:t>
+      </w:r>
+      <w:r>
+        <w:rPr>
+          <w:rFonts w:ascii="Times New Roman" w:hAnsi="Times New Roman"/>
+          <w:b w:val="0"/>
+          <w:sz w:val="21"/>
+        </w:rPr>
+        <w:tab/>
+        <w:t>15</w:t>
+      </w:r>
+    </w:p>
+    <w:p>
+      <w:pPr>
+        <w:pStyle w:val="TOC1"/>
+      </w:pPr>
+      <w:r>
+        <w:rPr>
+          <w:rFonts w:ascii="Times New Roman" w:hAnsi="Times New Roman"/>
+          <w:b/>
+          <w:sz w:val="21"/>
+        </w:rPr>
+        <w:t>BAB VI  KESIMPULAN DAN SARAN</w:t>
+      </w:r>
+      <w:r>
+        <w:rPr>
+          <w:rFonts w:ascii="Times New Roman" w:hAnsi="Times New Roman"/>
+          <w:b/>
+          <w:sz w:val="21"/>
+        </w:rPr>
+        <w:tab/>
+        <w:t>16</w:t>
+      </w:r>
+    </w:p>
+    <w:p>
+      <w:pPr>
+        <w:pStyle w:val="TOC2"/>
+      </w:pPr>
+      <w:r>
+        <w:rPr>
+          <w:rFonts w:ascii="Times New Roman" w:hAnsi="Times New Roman"/>
+          <w:b w:val="0"/>
+          <w:sz w:val="21"/>
+        </w:rPr>
+        <w:t>6.1  Kesimpulan</w:t>
+      </w:r>
+      <w:r>
+        <w:rPr>
+          <w:rFonts w:ascii="Times New Roman" w:hAnsi="Times New Roman"/>
+          <w:b w:val="0"/>
+          <w:sz w:val="21"/>
+        </w:rPr>
+        <w:tab/>
+        <w:t>16</w:t>
+      </w:r>
+    </w:p>
+    <w:p>
+      <w:pPr>
+        <w:pStyle w:val="TOC2"/>
+      </w:pPr>
+      <w:r>
+        <w:rPr>
+          <w:rFonts w:ascii="Times New Roman" w:hAnsi="Times New Roman"/>
+          <w:b w:val="0"/>
+          <w:sz w:val="21"/>
+        </w:rPr>
+        <w:t>6.2  Saran</w:t>
+      </w:r>
+      <w:r>
+        <w:rPr>
+          <w:rFonts w:ascii="Times New Roman" w:hAnsi="Times New Roman"/>
+          <w:b w:val="0"/>
+          <w:sz w:val="21"/>
+        </w:rPr>
+        <w:tab/>
+        <w:t>16</w:t>
+      </w:r>
+    </w:p>
+    <w:p>
+      <w:pPr>
+        <w:pStyle w:val="TOC1"/>
+      </w:pPr>
+      <w:r>
+        <w:rPr>
+          <w:rFonts w:ascii="Times New Roman" w:hAnsi="Times New Roman"/>
+          <w:b/>
+          <w:sz w:val="21"/>
+        </w:rPr>
+        <w:t>DAFTAR PUSTAKA</w:t>
+      </w:r>
+      <w:r>
+        <w:rPr>
+          <w:rFonts w:ascii="Times New Roman" w:hAnsi="Times New Roman"/>
+          <w:b/>
+          <w:sz w:val="21"/>
+        </w:rPr>
+        <w:tab/>
+        <w:t>17</w:t>
+      </w:r>
+    </w:p>
+    <w:p>
+      <w:pPr>
+        <w:pStyle w:val="TOC1"/>
+      </w:pPr>
+      <w:r>
+        <w:rPr>
+          <w:rFonts w:ascii="Times New Roman" w:hAnsi="Times New Roman"/>
+          <w:b/>
+          <w:sz w:val="21"/>
+        </w:rPr>
+        <w:t>LAMPIRAN</w:t>
+      </w:r>
+      <w:r>
+        <w:rPr>
+          <w:rFonts w:ascii="Times New Roman" w:hAnsi="Times New Roman"/>
+          <w:b/>
+          <w:sz w:val="21"/>
+        </w:rPr>
+        <w:tab/>
+        <w:t>18</w:t>
+      </w:r>
+    </w:p>
+    <w:p>
+      <w:pPr>
+        <w:pStyle w:val="TOC3"/>
+      </w:pPr>
+      <w:r>
+        <w:rPr>
+          <w:rFonts w:ascii="Times New Roman" w:hAnsi="Times New Roman"/>
+          <w:b w:val="0"/>
+          <w:sz w:val="21"/>
+        </w:rPr>
+        <w:t>Lampiran 1  Rekapitulasi Perhitungan</w:t>
+      </w:r>
+      <w:r>
+        <w:rPr>
+          <w:rFonts w:ascii="Times New Roman" w:hAnsi="Times New Roman"/>
+          <w:b w:val="0"/>
+          <w:sz w:val="21"/>
+        </w:rPr>
+        <w:tab/>
+        <w:t>18</w:t>
+      </w:r>
+    </w:p>
+    <w:p>
+      <w:pPr>
+        <w:pStyle w:val="TOC3"/>
+      </w:pPr>
+      <w:r>
+        <w:rPr>
+          <w:rFonts w:ascii="Times New Roman" w:hAnsi="Times New Roman"/>
+          <w:b w:val="0"/>
+          <w:sz w:val="21"/>
+        </w:rPr>
+        <w:t>Lampiran 2  Daftar Asumsi</w:t>
+      </w:r>
+      <w:r>
+        <w:rPr>
+          <w:rFonts w:ascii="Times New Roman" w:hAnsi="Times New Roman"/>
+          <w:b w:val="0"/>
+          <w:sz w:val="21"/>
+        </w:rPr>
+        <w:tab/>
+        <w:t>18</w:t>
+      </w:r>
+    </w:p>
+    <w:p>
+      <w:pPr>
+        <w:pStyle w:val="TOC3"/>
+      </w:pPr>
+      <w:r>
+        <w:rPr>
+          <w:rFonts w:ascii="Times New Roman" w:hAnsi="Times New Roman"/>
+          <w:b w:val="0"/>
+          <w:sz w:val="21"/>
+        </w:rPr>
+        <w:t>Lampiran 3  Lima Mengapa, Pemenuhan Persyaratan Desain, Rubrik, dan Uji Ketahanan</w:t>
+      </w:r>
+      <w:r>
+        <w:rPr>
+          <w:rFonts w:ascii="Times New Roman" w:hAnsi="Times New Roman"/>
+          <w:b w:val="0"/>
+          <w:sz w:val="21"/>
+        </w:rPr>
+        <w:tab/>
+        <w:t>19</w:t>
+      </w:r>
+    </w:p>
+    <w:p>
+      <w:pPr>
+        <w:pStyle w:val="TOC3"/>
+      </w:pPr>
+      <w:r>
+        <w:rPr>
+          <w:rFonts w:ascii="Times New Roman" w:hAnsi="Times New Roman"/>
+          <w:b w:val="0"/>
+          <w:sz w:val="21"/>
+        </w:rPr>
+        <w:t>Lampiran 4  Uraian Rancangan Solusi Terpilih</w:t>
+      </w:r>
+      <w:r>
+        <w:rPr>
+          <w:rFonts w:ascii="Times New Roman" w:hAnsi="Times New Roman"/>
+          <w:b w:val="0"/>
+          <w:sz w:val="21"/>
+        </w:rPr>
+        <w:tab/>
+        <w:t>20</w:t>
+      </w:r>
+    </w:p>
+    <w:p>
+      <w:pPr>
+        <w:pStyle w:val="TOC3"/>
+      </w:pPr>
+      <w:r>
+        <w:rPr>
+          <w:rFonts w:ascii="Times New Roman" w:hAnsi="Times New Roman"/>
+          <w:b w:val="0"/>
+          <w:sz w:val="21"/>
+        </w:rPr>
+        <w:t>Lampiran 5  Data yang Belum Tersedia dan Cara Pengumpulannya</w:t>
+      </w:r>
+      <w:r>
+        <w:rPr>
+          <w:rFonts w:ascii="Times New Roman" w:hAnsi="Times New Roman"/>
+          <w:b w:val="0"/>
+          <w:sz w:val="21"/>
+        </w:rPr>
+        <w:tab/>
+        <w:t>21</w:t>
+      </w:r>
+    </w:p>
+    <w:p>
+      <w:pPr>
+        <w:pStyle w:val="TOC3"/>
+      </w:pPr>
+      <w:r>
+        <w:rPr>
+          <w:rFonts w:ascii="Times New Roman" w:hAnsi="Times New Roman"/>
+          <w:b w:val="0"/>
+          <w:sz w:val="21"/>
+        </w:rPr>
+        <w:t>Lampiran 6  Rincian Biaya</w:t>
+      </w:r>
+      <w:r>
+        <w:rPr>
+          <w:rFonts w:ascii="Times New Roman" w:hAnsi="Times New Roman"/>
+          <w:b w:val="0"/>
+          <w:sz w:val="21"/>
+        </w:rPr>
+        <w:tab/>
+        <w:t>21</w:t>
+      </w:r>
+    </w:p>
+    <w:p>
+      <w:pPr>
+        <w:pStyle w:val="TOC3"/>
+      </w:pPr>
+      <w:r>
+        <w:rPr>
+          <w:rFonts w:ascii="Times New Roman" w:hAnsi="Times New Roman"/>
+          <w:b w:val="0"/>
+          <w:sz w:val="21"/>
+        </w:rPr>
+        <w:t>Lampiran 7  Register Risiko Lengkap</w:t>
+      </w:r>
+      <w:r>
+        <w:rPr>
+          <w:rFonts w:ascii="Times New Roman" w:hAnsi="Times New Roman"/>
+          <w:b w:val="0"/>
+          <w:sz w:val="21"/>
+        </w:rPr>
+        <w:tab/>
+        <w:t>21</w:t>
+      </w:r>
+    </w:p>
+    <w:p>
+      <w:pPr>
+        <w:pStyle w:val="TOC3"/>
+      </w:pPr>
+      <w:r>
+        <w:rPr>
+          <w:rFonts w:ascii="Times New Roman" w:hAnsi="Times New Roman"/>
+          <w:b w:val="0"/>
+          <w:sz w:val="21"/>
+        </w:rPr>
+        <w:t>Lampiran 8  Jadwal, RACI, dan Definisi Operasional KPI</w:t>
+      </w:r>
+      <w:r>
+        <w:rPr>
+          <w:rFonts w:ascii="Times New Roman" w:hAnsi="Times New Roman"/>
+          <w:b w:val="0"/>
+          <w:sz w:val="21"/>
+        </w:rPr>
+        <w:tab/>
+        <w:t>22</w:t>
+      </w:r>
+      <w:r>
+        <w:fldChar w:fldCharType="end"/>
       </w:r>
     </w:p>
     <w:p>
@@ -1020,7 +1971,6 @@
     </w:p>
     <w:tbl>
       <w:tblPr>
-        <w:tblW w:type="auto" w:w="0"/>
         <w:jc w:val="center"/>
         <w:tblLayout w:type="fixed"/>
         <w:tblLook w:firstColumn="1" w:firstRow="1" w:lastColumn="0" w:lastRow="0" w:noHBand="0" w:noVBand="1" w:val="04A0"/>
@@ -1038,11 +1988,13 @@
           <w:bottom w:w="40" w:type="dxa"/>
           <w:right w:w="80" w:type="dxa"/>
         </w:tblCellMar>
+        <w:tblW w:w="8958" w:type="dxa"/>
+        <w:tblLayout w:type="fixed"/>
       </w:tblPr>
       <w:tblGrid>
-        <w:gridCol w:w="3009"/>
-        <w:gridCol w:w="3009"/>
-        <w:gridCol w:w="3009"/>
+        <w:gridCol w:w="2268"/>
+        <w:gridCol w:w="3572"/>
+        <w:gridCol w:w="3118"/>
       </w:tblGrid>
       <w:tr>
         <w:trPr>
@@ -1582,7 +2534,6 @@
     </w:p>
     <w:tbl>
       <w:tblPr>
-        <w:tblW w:type="auto" w:w="0"/>
         <w:jc w:val="center"/>
         <w:tblLayout w:type="fixed"/>
         <w:tblLook w:firstColumn="1" w:firstRow="1" w:lastColumn="0" w:lastRow="0" w:noHBand="0" w:noVBand="1" w:val="04A0"/>
@@ -1600,12 +2551,14 @@
           <w:bottom w:w="40" w:type="dxa"/>
           <w:right w:w="80" w:type="dxa"/>
         </w:tblCellMar>
+        <w:tblW w:w="8958" w:type="dxa"/>
+        <w:tblLayout w:type="fixed"/>
       </w:tblPr>
       <w:tblGrid>
-        <w:gridCol w:w="2256"/>
-        <w:gridCol w:w="2256"/>
-        <w:gridCol w:w="2256"/>
-        <w:gridCol w:w="2256"/>
+        <w:gridCol w:w="2438"/>
+        <w:gridCol w:w="3742"/>
+        <w:gridCol w:w="1757"/>
+        <w:gridCol w:w="1020"/>
       </w:tblGrid>
       <w:tr>
         <w:trPr>
@@ -2844,7 +3797,6 @@
     </w:p>
     <w:tbl>
       <w:tblPr>
-        <w:tblW w:type="auto" w:w="0"/>
         <w:jc w:val="center"/>
         <w:tblLayout w:type="fixed"/>
         <w:tblLook w:firstColumn="1" w:firstRow="1" w:lastColumn="0" w:lastRow="0" w:noHBand="0" w:noVBand="1" w:val="04A0"/>
@@ -2862,12 +3814,14 @@
           <w:bottom w:w="40" w:type="dxa"/>
           <w:right w:w="80" w:type="dxa"/>
         </w:tblCellMar>
+        <w:tblW w:w="8958" w:type="dxa"/>
+        <w:tblLayout w:type="fixed"/>
       </w:tblPr>
       <w:tblGrid>
-        <w:gridCol w:w="2256"/>
-        <w:gridCol w:w="2256"/>
-        <w:gridCol w:w="2256"/>
-        <w:gridCol w:w="2256"/>
+        <w:gridCol w:w="623"/>
+        <w:gridCol w:w="2835"/>
+        <w:gridCol w:w="793"/>
+        <w:gridCol w:w="4706"/>
       </w:tblGrid>
       <w:tr>
         <w:trPr>
@@ -3642,7 +4596,6 @@
     </w:p>
     <w:tbl>
       <w:tblPr>
-        <w:tblW w:type="auto" w:w="0"/>
         <w:jc w:val="center"/>
         <w:tblLayout w:type="fixed"/>
         <w:tblLook w:firstColumn="1" w:firstRow="1" w:lastColumn="0" w:lastRow="0" w:noHBand="0" w:noVBand="1" w:val="04A0"/>
@@ -3660,13 +4613,15 @@
           <w:bottom w:w="40" w:type="dxa"/>
           <w:right w:w="80" w:type="dxa"/>
         </w:tblCellMar>
+        <w:tblW w:w="8958" w:type="dxa"/>
+        <w:tblLayout w:type="fixed"/>
       </w:tblPr>
       <w:tblGrid>
-        <w:gridCol w:w="1805"/>
-        <w:gridCol w:w="1805"/>
-        <w:gridCol w:w="1805"/>
-        <w:gridCol w:w="1805"/>
-        <w:gridCol w:w="1805"/>
+        <w:gridCol w:w="2664"/>
+        <w:gridCol w:w="1644"/>
+        <w:gridCol w:w="1474"/>
+        <w:gridCol w:w="1701"/>
+        <w:gridCol w:w="1474"/>
       </w:tblGrid>
       <w:tr>
         <w:trPr>
@@ -4739,7 +5694,6 @@
     </w:p>
     <w:tbl>
       <w:tblPr>
-        <w:tblW w:type="auto" w:w="0"/>
         <w:jc w:val="center"/>
         <w:tblLayout w:type="fixed"/>
         <w:tblLook w:firstColumn="1" w:firstRow="1" w:lastColumn="0" w:lastRow="0" w:noHBand="0" w:noVBand="1" w:val="04A0"/>
@@ -4757,15 +5711,17 @@
           <w:bottom w:w="40" w:type="dxa"/>
           <w:right w:w="80" w:type="dxa"/>
         </w:tblCellMar>
+        <w:tblW w:w="8958" w:type="dxa"/>
+        <w:tblLayout w:type="fixed"/>
       </w:tblPr>
       <w:tblGrid>
-        <w:gridCol w:w="1289"/>
-        <w:gridCol w:w="1289"/>
-        <w:gridCol w:w="1289"/>
-        <w:gridCol w:w="1289"/>
-        <w:gridCol w:w="1289"/>
-        <w:gridCol w:w="1289"/>
-        <w:gridCol w:w="1289"/>
+        <w:gridCol w:w="623"/>
+        <w:gridCol w:w="3118"/>
+        <w:gridCol w:w="737"/>
+        <w:gridCol w:w="1134"/>
+        <w:gridCol w:w="1134"/>
+        <w:gridCol w:w="1134"/>
+        <w:gridCol w:w="1077"/>
       </w:tblGrid>
       <w:tr>
         <w:trPr>
@@ -6560,7 +7516,6 @@
     </w:p>
     <w:tbl>
       <w:tblPr>
-        <w:tblW w:type="auto" w:w="0"/>
         <w:jc w:val="center"/>
         <w:tblLayout w:type="fixed"/>
         <w:tblLook w:firstColumn="1" w:firstRow="1" w:lastColumn="0" w:lastRow="0" w:noHBand="0" w:noVBand="1" w:val="04A0"/>
@@ -6578,12 +7533,14 @@
           <w:bottom w:w="40" w:type="dxa"/>
           <w:right w:w="80" w:type="dxa"/>
         </w:tblCellMar>
+        <w:tblW w:w="8958" w:type="dxa"/>
+        <w:tblLayout w:type="fixed"/>
       </w:tblPr>
       <w:tblGrid>
-        <w:gridCol w:w="2256"/>
-        <w:gridCol w:w="2256"/>
-        <w:gridCol w:w="2256"/>
-        <w:gridCol w:w="2256"/>
+        <w:gridCol w:w="1814"/>
+        <w:gridCol w:w="793"/>
+        <w:gridCol w:w="3742"/>
+        <w:gridCol w:w="2608"/>
       </w:tblGrid>
       <w:tr>
         <w:trPr>
@@ -7191,7 +8148,6 @@
     </w:p>
     <w:tbl>
       <w:tblPr>
-        <w:tblW w:type="auto" w:w="0"/>
         <w:jc w:val="center"/>
         <w:tblLayout w:type="fixed"/>
         <w:tblLook w:firstColumn="1" w:firstRow="1" w:lastColumn="0" w:lastRow="0" w:noHBand="0" w:noVBand="1" w:val="04A0"/>
@@ -7209,15 +8165,17 @@
           <w:bottom w:w="40" w:type="dxa"/>
           <w:right w:w="80" w:type="dxa"/>
         </w:tblCellMar>
+        <w:tblW w:w="8958" w:type="dxa"/>
+        <w:tblLayout w:type="fixed"/>
       </w:tblPr>
       <w:tblGrid>
-        <w:gridCol w:w="1289"/>
-        <w:gridCol w:w="1289"/>
-        <w:gridCol w:w="1289"/>
-        <w:gridCol w:w="1289"/>
-        <w:gridCol w:w="1289"/>
-        <w:gridCol w:w="1289"/>
-        <w:gridCol w:w="1289"/>
+        <w:gridCol w:w="623"/>
+        <w:gridCol w:w="2778"/>
+        <w:gridCol w:w="1077"/>
+        <w:gridCol w:w="396"/>
+        <w:gridCol w:w="396"/>
+        <w:gridCol w:w="567"/>
+        <w:gridCol w:w="3118"/>
       </w:tblGrid>
       <w:tr>
         <w:trPr>
@@ -8093,7 +9051,6 @@
     </w:p>
     <w:tbl>
       <w:tblPr>
-        <w:tblW w:type="auto" w:w="0"/>
         <w:jc w:val="center"/>
         <w:tblLayout w:type="fixed"/>
         <w:tblLook w:firstColumn="1" w:firstRow="1" w:lastColumn="0" w:lastRow="0" w:noHBand="0" w:noVBand="1" w:val="04A0"/>
@@ -8111,13 +9068,15 @@
           <w:bottom w:w="40" w:type="dxa"/>
           <w:right w:w="80" w:type="dxa"/>
         </w:tblCellMar>
+        <w:tblW w:w="8958" w:type="dxa"/>
+        <w:tblLayout w:type="fixed"/>
       </w:tblPr>
       <w:tblGrid>
-        <w:gridCol w:w="1805"/>
-        <w:gridCol w:w="1805"/>
-        <w:gridCol w:w="1805"/>
-        <w:gridCol w:w="1805"/>
-        <w:gridCol w:w="1805"/>
+        <w:gridCol w:w="623"/>
+        <w:gridCol w:w="2494"/>
+        <w:gridCol w:w="2041"/>
+        <w:gridCol w:w="1871"/>
+        <w:gridCol w:w="1927"/>
       </w:tblGrid>
       <w:tr>
         <w:trPr>
@@ -10046,7 +11005,6 @@
     </w:p>
     <w:tbl>
       <w:tblPr>
-        <w:tblW w:type="auto" w:w="0"/>
         <w:jc w:val="center"/>
         <w:tblLayout w:type="fixed"/>
         <w:tblLook w:firstColumn="1" w:firstRow="1" w:lastColumn="0" w:lastRow="0" w:noHBand="0" w:noVBand="1" w:val="04A0"/>
@@ -10064,17 +11022,19 @@
           <w:bottom w:w="40" w:type="dxa"/>
           <w:right w:w="80" w:type="dxa"/>
         </w:tblCellMar>
+        <w:tblW w:w="8618" w:type="dxa"/>
+        <w:tblLayout w:type="fixed"/>
       </w:tblPr>
       <w:tblGrid>
-        <w:gridCol w:w="1003"/>
-        <w:gridCol w:w="1003"/>
-        <w:gridCol w:w="1003"/>
-        <w:gridCol w:w="1003"/>
-        <w:gridCol w:w="1003"/>
-        <w:gridCol w:w="1003"/>
-        <w:gridCol w:w="1003"/>
-        <w:gridCol w:w="1003"/>
-        <w:gridCol w:w="1003"/>
+        <w:gridCol w:w="1757"/>
+        <w:gridCol w:w="850"/>
+        <w:gridCol w:w="907"/>
+        <w:gridCol w:w="963"/>
+        <w:gridCol w:w="907"/>
+        <w:gridCol w:w="850"/>
+        <w:gridCol w:w="737"/>
+        <w:gridCol w:w="793"/>
+        <w:gridCol w:w="850"/>
       </w:tblGrid>
       <w:tr>
         <w:trPr>
@@ -11164,7 +12124,6 @@
     </w:p>
     <w:tbl>
       <w:tblPr>
-        <w:tblW w:type="auto" w:w="0"/>
         <w:jc w:val="center"/>
         <w:tblLayout w:type="fixed"/>
         <w:tblLook w:firstColumn="1" w:firstRow="1" w:lastColumn="0" w:lastRow="0" w:noHBand="0" w:noVBand="1" w:val="04A0"/>
@@ -11182,13 +12141,15 @@
           <w:bottom w:w="40" w:type="dxa"/>
           <w:right w:w="80" w:type="dxa"/>
         </w:tblCellMar>
+        <w:tblW w:w="8958" w:type="dxa"/>
+        <w:tblLayout w:type="fixed"/>
       </w:tblPr>
       <w:tblGrid>
-        <w:gridCol w:w="1805"/>
-        <w:gridCol w:w="1805"/>
-        <w:gridCol w:w="1805"/>
-        <w:gridCol w:w="1805"/>
-        <w:gridCol w:w="1805"/>
+        <w:gridCol w:w="567"/>
+        <w:gridCol w:w="2154"/>
+        <w:gridCol w:w="1304"/>
+        <w:gridCol w:w="2438"/>
+        <w:gridCol w:w="2494"/>
       </w:tblGrid>
       <w:tr>
         <w:trPr>
@@ -13049,7 +14010,6 @@
     </w:p>
     <w:tbl>
       <w:tblPr>
-        <w:tblW w:type="auto" w:w="0"/>
         <w:jc w:val="center"/>
         <w:tblLayout w:type="fixed"/>
         <w:tblLook w:firstColumn="1" w:firstRow="1" w:lastColumn="0" w:lastRow="0" w:noHBand="0" w:noVBand="1" w:val="04A0"/>
@@ -13067,11 +14027,13 @@
           <w:bottom w:w="40" w:type="dxa"/>
           <w:right w:w="80" w:type="dxa"/>
         </w:tblCellMar>
+        <w:tblW w:w="8958" w:type="dxa"/>
+        <w:tblLayout w:type="fixed"/>
       </w:tblPr>
       <w:tblGrid>
-        <w:gridCol w:w="3009"/>
-        <w:gridCol w:w="3009"/>
-        <w:gridCol w:w="3009"/>
+        <w:gridCol w:w="1077"/>
+        <w:gridCol w:w="3061"/>
+        <w:gridCol w:w="4819"/>
       </w:tblGrid>
       <w:tr>
         <w:trPr>
@@ -13528,7 +14490,6 @@
     </w:p>
     <w:tbl>
       <w:tblPr>
-        <w:tblW w:type="auto" w:w="0"/>
         <w:jc w:val="center"/>
         <w:tblLayout w:type="fixed"/>
         <w:tblLook w:firstColumn="1" w:firstRow="1" w:lastColumn="0" w:lastRow="0" w:noHBand="0" w:noVBand="1" w:val="04A0"/>
@@ -13546,13 +14507,15 @@
           <w:bottom w:w="40" w:type="dxa"/>
           <w:right w:w="80" w:type="dxa"/>
         </w:tblCellMar>
+        <w:tblW w:w="8958" w:type="dxa"/>
+        <w:tblLayout w:type="fixed"/>
       </w:tblPr>
       <w:tblGrid>
-        <w:gridCol w:w="1805"/>
-        <w:gridCol w:w="1805"/>
-        <w:gridCol w:w="1805"/>
-        <w:gridCol w:w="1805"/>
-        <w:gridCol w:w="1805"/>
+        <w:gridCol w:w="4762"/>
+        <w:gridCol w:w="1077"/>
+        <w:gridCol w:w="1077"/>
+        <w:gridCol w:w="1077"/>
+        <w:gridCol w:w="963"/>
       </w:tblGrid>
       <w:tr>
         <w:trPr>
@@ -14595,7 +15558,6 @@
     </w:p>
     <w:tbl>
       <w:tblPr>
-        <w:tblW w:type="auto" w:w="0"/>
         <w:jc w:val="center"/>
         <w:tblLayout w:type="fixed"/>
         <w:tblLook w:firstColumn="1" w:firstRow="1" w:lastColumn="0" w:lastRow="0" w:noHBand="0" w:noVBand="1" w:val="04A0"/>
@@ -14613,14 +15575,16 @@
           <w:bottom w:w="40" w:type="dxa"/>
           <w:right w:w="80" w:type="dxa"/>
         </w:tblCellMar>
+        <w:tblW w:w="8845" w:type="dxa"/>
+        <w:tblLayout w:type="fixed"/>
       </w:tblPr>
       <w:tblGrid>
-        <w:gridCol w:w="1504"/>
-        <w:gridCol w:w="1504"/>
-        <w:gridCol w:w="1504"/>
-        <w:gridCol w:w="1504"/>
-        <w:gridCol w:w="1504"/>
-        <w:gridCol w:w="1504"/>
+        <w:gridCol w:w="3628"/>
+        <w:gridCol w:w="1020"/>
+        <w:gridCol w:w="1020"/>
+        <w:gridCol w:w="1020"/>
+        <w:gridCol w:w="1020"/>
+        <w:gridCol w:w="1134"/>
       </w:tblGrid>
       <w:tr>
         <w:trPr>
@@ -15446,7 +16410,6 @@
     </w:p>
     <w:tbl>
       <w:tblPr>
-        <w:tblW w:type="auto" w:w="0"/>
         <w:jc w:val="center"/>
         <w:tblLayout w:type="fixed"/>
         <w:tblLook w:firstColumn="1" w:firstRow="1" w:lastColumn="0" w:lastRow="0" w:noHBand="0" w:noVBand="1" w:val="04A0"/>
@@ -15464,14 +16427,16 @@
           <w:bottom w:w="40" w:type="dxa"/>
           <w:right w:w="80" w:type="dxa"/>
         </w:tblCellMar>
+        <w:tblW w:w="8845" w:type="dxa"/>
+        <w:tblLayout w:type="fixed"/>
       </w:tblPr>
       <w:tblGrid>
-        <w:gridCol w:w="1504"/>
-        <w:gridCol w:w="1504"/>
-        <w:gridCol w:w="1504"/>
-        <w:gridCol w:w="1504"/>
-        <w:gridCol w:w="1504"/>
-        <w:gridCol w:w="1504"/>
+        <w:gridCol w:w="453"/>
+        <w:gridCol w:w="1927"/>
+        <w:gridCol w:w="1814"/>
+        <w:gridCol w:w="2381"/>
+        <w:gridCol w:w="1474"/>
+        <w:gridCol w:w="793"/>
       </w:tblGrid>
       <w:tr>
         <w:trPr>
@@ -16993,7 +17958,6 @@
     </w:p>
     <w:tbl>
       <w:tblPr>
-        <w:tblW w:type="auto" w:w="0"/>
         <w:jc w:val="center"/>
         <w:tblLayout w:type="fixed"/>
         <w:tblLook w:firstColumn="1" w:firstRow="1" w:lastColumn="0" w:lastRow="0" w:noHBand="0" w:noVBand="1" w:val="04A0"/>
@@ -17011,12 +17975,14 @@
           <w:bottom w:w="40" w:type="dxa"/>
           <w:right w:w="80" w:type="dxa"/>
         </w:tblCellMar>
+        <w:tblW w:w="8958" w:type="dxa"/>
+        <w:tblLayout w:type="fixed"/>
       </w:tblPr>
       <w:tblGrid>
-        <w:gridCol w:w="2256"/>
-        <w:gridCol w:w="2256"/>
-        <w:gridCol w:w="2256"/>
-        <w:gridCol w:w="2256"/>
+        <w:gridCol w:w="3118"/>
+        <w:gridCol w:w="1360"/>
+        <w:gridCol w:w="3061"/>
+        <w:gridCol w:w="1417"/>
       </w:tblGrid>
       <w:tr>
         <w:trPr>
@@ -17704,7 +18670,6 @@
     </w:p>
     <w:tbl>
       <w:tblPr>
-        <w:tblW w:type="auto" w:w="0"/>
         <w:jc w:val="center"/>
         <w:tblLayout w:type="fixed"/>
         <w:tblLook w:firstColumn="1" w:firstRow="1" w:lastColumn="0" w:lastRow="0" w:noHBand="0" w:noVBand="1" w:val="04A0"/>
@@ -17722,15 +18687,17 @@
           <w:bottom w:w="40" w:type="dxa"/>
           <w:right w:w="80" w:type="dxa"/>
         </w:tblCellMar>
+        <w:tblW w:w="8958" w:type="dxa"/>
+        <w:tblLayout w:type="fixed"/>
       </w:tblPr>
       <w:tblGrid>
-        <w:gridCol w:w="1289"/>
-        <w:gridCol w:w="1289"/>
-        <w:gridCol w:w="1289"/>
-        <w:gridCol w:w="1289"/>
-        <w:gridCol w:w="1289"/>
-        <w:gridCol w:w="1289"/>
-        <w:gridCol w:w="1289"/>
+        <w:gridCol w:w="567"/>
+        <w:gridCol w:w="3061"/>
+        <w:gridCol w:w="1077"/>
+        <w:gridCol w:w="396"/>
+        <w:gridCol w:w="396"/>
+        <w:gridCol w:w="567"/>
+        <w:gridCol w:w="2891"/>
       </w:tblGrid>
       <w:tr>
         <w:trPr>
@@ -20233,7 +21200,6 @@
     </w:p>
     <w:tbl>
       <w:tblPr>
-        <w:tblW w:type="auto" w:w="0"/>
         <w:jc w:val="center"/>
         <w:tblLayout w:type="fixed"/>
         <w:tblLook w:firstColumn="1" w:firstRow="1" w:lastColumn="0" w:lastRow="0" w:noHBand="0" w:noVBand="1" w:val="04A0"/>
@@ -20251,15 +21217,17 @@
           <w:bottom w:w="40" w:type="dxa"/>
           <w:right w:w="80" w:type="dxa"/>
         </w:tblCellMar>
+        <w:tblW w:w="8958" w:type="dxa"/>
+        <w:tblLayout w:type="fixed"/>
       </w:tblPr>
       <w:tblGrid>
-        <w:gridCol w:w="1289"/>
-        <w:gridCol w:w="1289"/>
-        <w:gridCol w:w="1289"/>
-        <w:gridCol w:w="1289"/>
-        <w:gridCol w:w="1289"/>
-        <w:gridCol w:w="1289"/>
-        <w:gridCol w:w="1289"/>
+        <w:gridCol w:w="3515"/>
+        <w:gridCol w:w="963"/>
+        <w:gridCol w:w="963"/>
+        <w:gridCol w:w="963"/>
+        <w:gridCol w:w="963"/>
+        <w:gridCol w:w="737"/>
+        <w:gridCol w:w="850"/>
       </w:tblGrid>
       <w:tr>
         <w:trPr>
@@ -22026,7 +22994,6 @@
     </w:p>
     <w:tbl>
       <w:tblPr>
-        <w:tblW w:type="auto" w:w="0"/>
         <w:jc w:val="center"/>
         <w:tblLayout w:type="fixed"/>
         <w:tblLook w:firstColumn="1" w:firstRow="1" w:lastColumn="0" w:lastRow="0" w:noHBand="0" w:noVBand="1" w:val="04A0"/>
@@ -22044,13 +23011,15 @@
           <w:bottom w:w="40" w:type="dxa"/>
           <w:right w:w="80" w:type="dxa"/>
         </w:tblCellMar>
+        <w:tblW w:w="8958" w:type="dxa"/>
+        <w:tblLayout w:type="fixed"/>
       </w:tblPr>
       <w:tblGrid>
-        <w:gridCol w:w="1805"/>
-        <w:gridCol w:w="1805"/>
-        <w:gridCol w:w="1805"/>
-        <w:gridCol w:w="1805"/>
-        <w:gridCol w:w="1805"/>
+        <w:gridCol w:w="623"/>
+        <w:gridCol w:w="1871"/>
+        <w:gridCol w:w="3402"/>
+        <w:gridCol w:w="1927"/>
+        <w:gridCol w:w="1134"/>
       </w:tblGrid>
       <w:tr>
         <w:trPr>
@@ -35519,6 +36488,57 @@
       </w:tcPr>
     </w:tblStylePr>
   </w:style>
+  <w:style w:type="paragraph" w:customStyle="1" w:styleId="TOC1">
+    <w:name w:val="TOC 1"/>
+    <w:basedOn w:val="Normal"/>
+    <w:pPr>
+      <w:tabs>
+        <w:tab w:pos="9014" w:val="right" w:leader="dot"/>
+      </w:tabs>
+      <w:spacing w:before="80" w:after="0" w:line="240" w:lineRule="auto"/>
+      <w:ind w:left="0" w:firstLine="0"/>
+      <w:jc w:val="left"/>
+    </w:pPr>
+    <w:rPr>
+      <w:rFonts w:ascii="Times New Roman" w:hAnsi="Times New Roman"/>
+      <w:b/>
+      <w:sz w:val="21"/>
+    </w:rPr>
+  </w:style>
+  <w:style w:type="paragraph" w:customStyle="1" w:styleId="TOC2">
+    <w:name w:val="TOC 2"/>
+    <w:basedOn w:val="Normal"/>
+    <w:pPr>
+      <w:tabs>
+        <w:tab w:pos="9014" w:val="right" w:leader="dot"/>
+      </w:tabs>
+      <w:spacing w:before="0" w:after="0" w:line="240" w:lineRule="auto"/>
+      <w:ind w:left="340" w:firstLine="0"/>
+      <w:jc w:val="left"/>
+    </w:pPr>
+    <w:rPr>
+      <w:rFonts w:ascii="Times New Roman" w:hAnsi="Times New Roman"/>
+      <w:b w:val="0"/>
+      <w:sz w:val="21"/>
+    </w:rPr>
+  </w:style>
+  <w:style w:type="paragraph" w:customStyle="1" w:styleId="TOC3">
+    <w:name w:val="TOC 3"/>
+    <w:basedOn w:val="Normal"/>
+    <w:pPr>
+      <w:tabs>
+        <w:tab w:pos="9014" w:val="right" w:leader="dot"/>
+      </w:tabs>
+      <w:spacing w:before="0" w:after="0" w:line="240" w:lineRule="auto"/>
+      <w:ind w:left="680" w:firstLine="0"/>
+      <w:jc w:val="left"/>
+    </w:pPr>
+    <w:rPr>
+      <w:rFonts w:ascii="Times New Roman" w:hAnsi="Times New Roman"/>
+      <w:b w:val="0"/>
+      <w:sz w:val="21"/>
+    </w:rPr>
+  </w:style>
 </w:styles>
 </file>
 

</xml_diff>